<commit_message>
ligeros cambios en el doc y más mockups
</commit_message>
<xml_diff>
--- a/requisitos/entrega_parcial_prototipo.docx
+++ b/requisitos/entrega_parcial_prototipo.docx
@@ -739,16 +739,7 @@
           <w:szCs w:val="24"/>
           <w:lang w:val="es-ES"/>
         </w:rPr>
-        <w:t>Repetir pasos 4-6</w:t>
-      </w:r>
-      <w:r>
-        <w:rPr>
-          <w:rFonts w:eastAsia="Aptos" w:cs="Aptos"/>
-          <w:sz w:val="24"/>
-          <w:szCs w:val="24"/>
-          <w:lang w:val="es-ES"/>
-        </w:rPr>
-        <w:t xml:space="preserve"> hasta que se finalizan todas las pantallas del curso.</w:t>
+        <w:t>Repetir pasos 4-6 hasta que se finalizan todas las pantallas del curso.</w:t>
       </w:r>
     </w:p>
     <w:p>
@@ -774,34 +765,7 @@
           <w:szCs w:val="24"/>
           <w:lang w:val="es-ES"/>
         </w:rPr>
-        <w:t>E</w:t>
-      </w:r>
-      <w:r>
-        <w:rPr>
-          <w:rFonts w:eastAsia="Aptos" w:cs="Aptos"/>
-          <w:sz w:val="24"/>
-          <w:szCs w:val="24"/>
-          <w:lang w:val="es-ES"/>
-        </w:rPr>
-        <w:t xml:space="preserve">l sistema presenta un resumen del rendimiento (puntuación </w:t>
-      </w:r>
-      <w:r>
-        <w:rPr>
-          <w:rFonts w:eastAsia="Aptos" w:cs="Aptos"/>
-          <w:sz w:val="24"/>
-          <w:szCs w:val="24"/>
-          <w:lang w:val="es-ES"/>
-        </w:rPr>
-        <w:t>y</w:t>
-      </w:r>
-      <w:r>
-        <w:rPr>
-          <w:rFonts w:eastAsia="Aptos" w:cs="Aptos"/>
-          <w:sz w:val="24"/>
-          <w:szCs w:val="24"/>
-          <w:lang w:val="es-ES"/>
-        </w:rPr>
-        <w:t xml:space="preserve"> estadísticas).</w:t>
+        <w:t>El sistema presenta un resumen del rendimiento (puntuación y estadísticas).</w:t>
       </w:r>
     </w:p>
     <w:p>
@@ -886,16 +850,7 @@
           <w:szCs w:val="24"/>
           <w:lang w:val="es-ES"/>
         </w:rPr>
-        <w:t xml:space="preserve">Se actualiza el progreso del usuario </w:t>
-      </w:r>
-      <w:r>
-        <w:rPr>
-          <w:rFonts w:eastAsia="Aptos" w:cs="Aptos"/>
-          <w:sz w:val="24"/>
-          <w:szCs w:val="24"/>
-          <w:lang w:val="es-ES"/>
-        </w:rPr>
-        <w:t>en el curso.</w:t>
+        <w:t>Se actualiza el progreso del usuario en el curso.</w:t>
       </w:r>
     </w:p>
     <w:p>
@@ -921,25 +876,7 @@
           <w:szCs w:val="24"/>
           <w:lang w:val="es-ES"/>
         </w:rPr>
-        <w:t xml:space="preserve">Se almacenan las estadísticas de uso del curso </w:t>
-      </w:r>
-      <w:r>
-        <w:rPr>
-          <w:rFonts w:eastAsia="Aptos" w:cs="Aptos"/>
-          <w:sz w:val="24"/>
-          <w:szCs w:val="24"/>
-          <w:lang w:val="es-ES"/>
-        </w:rPr>
-        <w:t>para el usuario</w:t>
-      </w:r>
-      <w:r>
-        <w:rPr>
-          <w:rFonts w:eastAsia="Aptos" w:cs="Aptos"/>
-          <w:sz w:val="24"/>
-          <w:szCs w:val="24"/>
-          <w:lang w:val="es-ES"/>
-        </w:rPr>
-        <w:t>.</w:t>
+        <w:t>Se almacenan las estadísticas de uso del curso para el usuario.</w:t>
       </w:r>
     </w:p>
     <w:p>
@@ -1496,7 +1433,7 @@
           <w:szCs w:val="24"/>
           <w:lang w:val="es-ES"/>
         </w:rPr>
-        <w:t>El siguiente diagrama en PlantUML representa de forma simplificada el dominio del sistema enfocado en el fútbol. Se incluyen las entidades centrales para el manejo de usuarios, cursos, bloques de contenidos, preguntas (pantallas de aprendizaje) y estadísticas, así como la funcionalidad extra de insignias.</w:t>
+        <w:t>El siguiente diagrama en PlantUML representa el dominio del sistema. Se incluyen las entidades para el manejo de usuarios, cursos, bloques de contenidos, preguntas (pantallas de aprendizaje) y estadísticas, así como la funcionalidad extra de insignias.</w:t>
       </w:r>
     </w:p>
     <w:p>
@@ -1515,68 +1452,18 @@
       </w:pPr>
       <w:r>
         <w:rPr/>
-      </w:r>
-    </w:p>
-    <w:p>
-      <w:pPr>
-        <w:pStyle w:val="Normal"/>
-        <w:rPr/>
-      </w:pPr>
-      <w:r>
-        <w:rPr/>
-      </w:r>
-    </w:p>
-    <w:p>
-      <w:pPr>
-        <w:pStyle w:val="Normal"/>
-        <w:rPr/>
-      </w:pPr>
-      <w:r>
-        <w:rPr/>
-      </w:r>
-    </w:p>
-    <w:p>
-      <w:pPr>
-        <w:pStyle w:val="Normal"/>
-        <w:rPr/>
-      </w:pPr>
-      <w:r>
-        <w:rPr/>
-      </w:r>
-    </w:p>
-    <w:p>
-      <w:pPr>
-        <w:pStyle w:val="Normal"/>
-        <w:rPr/>
-      </w:pPr>
-      <w:r>
-        <w:rPr/>
-      </w:r>
-    </w:p>
-    <w:p>
-      <w:pPr>
-        <w:pStyle w:val="Normal"/>
-        <w:rPr/>
-      </w:pPr>
-      <w:r>
-        <w:rPr/>
-      </w:r>
-    </w:p>
-    <w:p>
-      <w:pPr>
-        <w:pStyle w:val="Normal"/>
-        <w:widowControl/>
-        <w:bidi w:val="0"/>
-        <w:spacing w:lineRule="auto" w:line="278" w:before="0" w:after="160"/>
-        <w:jc w:val="left"/>
-        <w:rPr/>
-      </w:pPr>
-      <w:r>
-        <w:rPr/>
         <w:drawing>
-          <wp:inline distT="0" distB="0" distL="0" distR="0">
-            <wp:extent cx="5724525" cy="4876800"/>
+          <wp:anchor behindDoc="0" distT="0" distB="0" distL="0" distR="0" simplePos="0" locked="0" layoutInCell="0" allowOverlap="1" relativeHeight="2">
+            <wp:simplePos x="0" y="0"/>
+            <wp:positionH relativeFrom="column">
+              <wp:posOffset>-352425</wp:posOffset>
+            </wp:positionH>
+            <wp:positionV relativeFrom="paragraph">
+              <wp:posOffset>-13335</wp:posOffset>
+            </wp:positionV>
+            <wp:extent cx="5731510" cy="3865880"/>
             <wp:effectExtent l="0" t="0" r="0" b="0"/>
+            <wp:wrapSquare wrapText="largest"/>
             <wp:docPr id="1" name="Imagen1" descr=""/>
             <wp:cNvGraphicFramePr>
               <a:graphicFrameLocks xmlns:a="http://schemas.openxmlformats.org/drawingml/2006/main" noChangeAspect="1"/>
@@ -1599,7 +1486,7 @@
                   <pic:spPr bwMode="auto">
                     <a:xfrm>
                       <a:off x="0" y="0"/>
-                      <a:ext cx="5724525" cy="4876800"/>
+                      <a:ext cx="5731510" cy="3865880"/>
                     </a:xfrm>
                     <a:prstGeom prst="rect">
                       <a:avLst/>
@@ -1608,8 +1495,66 @@
                 </pic:pic>
               </a:graphicData>
             </a:graphic>
-          </wp:inline>
+          </wp:anchor>
         </w:drawing>
+      </w:r>
+    </w:p>
+    <w:p>
+      <w:pPr>
+        <w:pStyle w:val="Normal"/>
+        <w:rPr/>
+      </w:pPr>
+      <w:r>
+        <w:rPr/>
+      </w:r>
+    </w:p>
+    <w:p>
+      <w:pPr>
+        <w:pStyle w:val="Normal"/>
+        <w:rPr/>
+      </w:pPr>
+      <w:r>
+        <w:rPr/>
+      </w:r>
+    </w:p>
+    <w:p>
+      <w:pPr>
+        <w:pStyle w:val="Normal"/>
+        <w:rPr/>
+      </w:pPr>
+      <w:r>
+        <w:rPr/>
+      </w:r>
+    </w:p>
+    <w:p>
+      <w:pPr>
+        <w:pStyle w:val="Normal"/>
+        <w:rPr/>
+      </w:pPr>
+      <w:r>
+        <w:rPr/>
+      </w:r>
+    </w:p>
+    <w:p>
+      <w:pPr>
+        <w:pStyle w:val="Normal"/>
+        <w:rPr/>
+      </w:pPr>
+      <w:r>
+        <w:rPr/>
+      </w:r>
+    </w:p>
+    <w:p>
+      <w:pPr>
+        <w:pStyle w:val="Normal"/>
+        <w:widowControl/>
+        <w:bidi w:val="0"/>
+        <w:spacing w:lineRule="auto" w:line="276" w:before="0" w:after="160"/>
+        <w:jc w:val="left"/>
+        <w:rPr/>
+      </w:pPr>
+      <w:r>
+        <w:rPr/>
       </w:r>
     </w:p>
     <w:sectPr>
@@ -3231,8 +3176,9 @@
     <w:qFormat/>
     <w:pPr>
       <w:widowControl/>
+      <w:suppressAutoHyphens w:val="true"/>
       <w:bidi w:val="0"/>
-      <w:spacing w:lineRule="auto" w:line="278" w:before="0" w:after="160"/>
+      <w:spacing w:lineRule="auto" w:line="276" w:before="0" w:after="160"/>
       <w:jc w:val="left"/>
     </w:pPr>
     <w:rPr>
@@ -3361,7 +3307,7 @@
       <w:szCs w:val="24"/>
     </w:rPr>
   </w:style>
-  <w:style w:type="paragraph" w:styleId="ndice">
+  <w:style w:type="paragraph" w:styleId="Ndice">
     <w:name w:val="Índice"/>
     <w:basedOn w:val="Normal"/>
     <w:qFormat/>

</xml_diff>